<commit_message>
Comunicação no agravo: inclui ID da habilitação protocolada na origem
Co-Authored-By: Claude Opus 5.5 <noreply@anthropic.com>
Claude-Session: https://claude.ai/code/session_01RSEcSvs1Px517d8mUYokdi
</commit_message>
<xml_diff>
--- a/0800122-42.2025 - Francisca Sousa/Comunicação de óbito no agravo - Francisca Sousa da Silva.docx
+++ b/0800122-42.2025 - Francisca Sousa/Comunicação de óbito no agravo - Francisca Sousa da Silva.docx
@@ -447,20 +447,22 @@
         <w:rPr>
           <w:rFonts w:ascii="Lora Medium" w:hAnsi="Lora Medium" w:cs="Lora Medium" w:eastAsia="Lora Medium"/>
         </w:rPr>
-        <w:t xml:space="preserve">A habilitação deve ser feita nos autos do processo principal, “na instância em que estiver” (art. 689 do CPC). Os sucessores já requereram a habilitação perante o Juízo de origem, nos autos nº 0800122-42.2025.8.18.0061 </w:t>
-      </w:r>
-      <w:r>
-        <w:rPr>
-          <w:rFonts w:ascii="Lora Medium" w:hAnsi="Lora Medium" w:cs="Lora Medium" w:eastAsia="Lora Medium"/>
-          <w:highlight w:val="yellow"/>
-        </w:rPr>
-        <w:t>(ID ________)</w:t>
-      </w:r>
-      <w:r>
-        <w:rPr>
-          <w:rFonts w:ascii="Lora Medium" w:hAnsi="Lora Medium" w:cs="Lora Medium" w:eastAsia="Lora Medium"/>
-        </w:rPr>
-        <w:t>, com toda a documentação necessária. [Doc. 04]</w:t>
+        <w:t>A habilitação deve ser feita nos autos do processo principal, “na instância em que estiver” (art. 689 do CPC). Os sucessores já requereram a habilitação perante o Juízo de origem, em 19/10/2026, nos autos nº 0800122-42.2025.8.18.0061 (</w:t>
+      </w:r>
+      <w:r>
+        <w:rPr>
+          <w:rFonts w:ascii="Lora Medium" w:hAnsi="Lora Medium" w:cs="Lora Medium" w:eastAsia="Lora Medium"/>
+          <w:b/>
+          <w:u w:val="single"/>
+          <w:shd w:val="clear" w:color="auto" w:fill="CFE2F3"/>
+        </w:rPr>
+        <w:t>ID 107118300</w:t>
+      </w:r>
+      <w:r>
+        <w:rPr>
+          <w:rFonts w:ascii="Lora Medium" w:hAnsi="Lora Medium" w:cs="Lora Medium" w:eastAsia="Lora Medium"/>
+        </w:rPr>
+        <w:t>, com documentos nos IDs 107118301 a 107118325). [Doc. 04]</w:t>
       </w:r>
     </w:p>
     <w:p>
@@ -867,7 +869,7 @@
         <w:rPr>
           <w:rFonts w:ascii="Lora Medium" w:hAnsi="Lora Medium" w:cs="Lora Medium" w:eastAsia="Lora Medium"/>
         </w:rPr>
-        <w:t>[Doc. 04 – Petição de habilitação de herdeiros protocolada no Juízo de origem.]</w:t>
+        <w:t>[Doc. 04 – Petição de habilitação de herdeiros protocolada no Juízo de origem em 19/10/2026 (ID 107118300).]</w:t>
       </w:r>
     </w:p>
     <w:p/>

</xml_diff>

<commit_message>
Comunicação no agravo: registra intimação frustrada da agravada (ID 37150869)
Co-Authored-By: Claude Opus 5.5 <noreply@anthropic.com>
Claude-Session: https://claude.ai/code/session_01RSEcSvs1Px517d8mUYokdi
</commit_message>
<xml_diff>
--- a/0800122-42.2025 - Francisca Sousa/Comunicação de óbito no agravo - Francisca Sousa da Silva.docx
+++ b/0800122-42.2025 - Francisca Sousa/Comunicação de óbito no agravo - Francisca Sousa da Silva.docx
@@ -402,6 +402,34 @@
           <w:rFonts w:ascii="Lora Medium" w:hAnsi="Lora Medium" w:cs="Lora Medium" w:eastAsia="Lora Medium"/>
         </w:rPr>
         <w:t>. Ele deve ser integralmente aberto aos sucessores após a habilitação, sob pena de violação ao contraditório e à ampla defesa (arts. 9º e 10 do CPC e art. 5º, LV, da Constituição Federal).</w:t>
+      </w:r>
+    </w:p>
+    <w:p>
+      <w:pPr>
+        <w:spacing w:line="360" w:lineRule="auto" w:after="60"/>
+        <w:ind w:firstLine="850"/>
+        <w:jc w:val="both"/>
+      </w:pPr>
+      <w:r>
+        <w:rPr>
+          <w:rFonts w:ascii="Lora Medium" w:hAnsi="Lora Medium" w:cs="Lora Medium" w:eastAsia="Lora Medium"/>
+        </w:rPr>
+        <w:t>Além disso, a própria tentativa de intimação da agravada falhou. A carta de intimação foi enviada para a Rua 2 de Março, nº 281, bairro COHEB, Miguel Alves/PI, endereço que nunca foi o da agravada, e retornou com a anotação “</w:t>
+      </w:r>
+      <w:r>
+        <w:rPr>
+          <w:rFonts w:ascii="Lora Medium" w:hAnsi="Lora Medium" w:cs="Lora Medium" w:eastAsia="Lora Medium"/>
+          <w:b/>
+          <w:u w:val="single"/>
+          <w:shd w:val="clear" w:color="auto" w:fill="CFE2F3"/>
+        </w:rPr>
+        <w:t>destinatário desconhecido no endereço</w:t>
+      </w:r>
+      <w:r>
+        <w:rPr>
+          <w:rFonts w:ascii="Lora Medium" w:hAnsi="Lora Medium" w:cs="Lora Medium" w:eastAsia="Lora Medium"/>
+        </w:rPr>
+        <w:t>” (ID 37150869, de 12/10/2026). A agravada residia na Rua Picos, nº 506, bairro São Miguel, endereço que consta da petição inicial e dos comprovantes juntados. Não houve, portanto, intimação válida, e nenhum prazo para contrarrazões começou a correr.</w:t>
       </w:r>
     </w:p>
     <w:p>

</xml_diff>

<commit_message>
Contrarrazões e comunicação no agravo: inclui precedentes do STJ e do TJPI
Co-Authored-By: Claude Opus 5.5 <noreply@anthropic.com>
Claude-Session: https://claude.ai/code/session_01RSEcSvs1Px517d8mUYokdi
</commit_message>
<xml_diff>
--- a/0800122-42.2025 - Francisca Sousa/Comunicação de óbito no agravo - Francisca Sousa da Silva.docx
+++ b/0800122-42.2025 - Francisca Sousa/Comunicação de óbito no agravo - Francisca Sousa da Silva.docx
@@ -573,6 +573,55 @@
         <w:t>c)</w:t>
         <w:tab/>
         <w:t>a falecida não deixou testamento, e não há inventário aberto, de modo que a legitimidade é dos próprios herdeiros (art. 1.784 do CC e art. 110 do CPC).</w:t>
+      </w:r>
+    </w:p>
+    <w:p>
+      <w:pPr>
+        <w:spacing w:line="360" w:lineRule="auto" w:after="60"/>
+        <w:ind w:firstLine="850"/>
+        <w:jc w:val="both"/>
+      </w:pPr>
+      <w:r>
+        <w:rPr>
+          <w:rFonts w:ascii="Lora Medium" w:hAnsi="Lora Medium" w:cs="Lora Medium" w:eastAsia="Lora Medium"/>
+        </w:rPr>
+        <w:t>A habilitação independe de inventário. O crédito decorre de descontos indevidos no benefício previdenciário da falecida, e o Superior Tribunal de Justiça, em recurso repetitivo, firmou que o art. 112 da Lei nº 8.213/1991, que dispensa inventário ou arrolamento para o pagamento de valores não recebidos em vida, aplica-se também no âmbito judicial:</w:t>
+      </w:r>
+    </w:p>
+    <w:p>
+      <w:pPr>
+        <w:spacing w:before="160" w:after="200" w:line="240" w:lineRule="auto"/>
+        <w:ind w:left="2270" w:right="570"/>
+        <w:jc w:val="both"/>
+        <w:pBdr>
+          <w:top w:val="single" w:color="9AA0A6" w:sz="4" w:space="6"/>
+        </w:pBdr>
+      </w:pPr>
+      <w:r>
+        <w:rPr>
+          <w:rFonts w:ascii="Lora Medium" w:hAnsi="Lora Medium" w:cs="Lora Medium" w:eastAsia="Lora Medium"/>
+          <w:i/>
+          <w:sz w:val="18"/>
+        </w:rPr>
+        <w:t>(...) (i) O disposto no art. 112 da Lei n. 8.213/1991, segundo o qual “o valor não recebido em vida pelo segurado só será pago aos seus dependentes habilitados à pensão por morte ou, na falta deles, aos seus sucessores na forma da lei civil, independentemente de inventário ou arrolamento”, é aplicável aos âmbitos judicial e administrativo (...). (STJ, REsp 1.856.969/RJ, Rel. Min. Regina Helena Costa, Primeira Seção, julgado em 23/06/2021, Tema 1.057)</w:t>
+      </w:r>
+    </w:p>
+    <w:p>
+      <w:pPr>
+        <w:spacing w:before="160" w:after="200" w:line="240" w:lineRule="auto"/>
+        <w:ind w:left="2270" w:right="570"/>
+        <w:jc w:val="both"/>
+        <w:pBdr>
+          <w:top w:val="single" w:color="9AA0A6" w:sz="4" w:space="6"/>
+        </w:pBdr>
+      </w:pPr>
+      <w:r>
+        <w:rPr>
+          <w:rFonts w:ascii="Lora Medium" w:hAnsi="Lora Medium" w:cs="Lora Medium" w:eastAsia="Lora Medium"/>
+          <w:i/>
+          <w:sz w:val="18"/>
+        </w:rPr>
+        <w:t>(...) I. Esta Corte firmou orientação segundo a qual sobrevindo o falecimento do autor, no curso do processo, seus dependentes previdenciários poderão habilitar-se para receber os valores devidos, independentemente de inventário ou arrolamento de bens (...). (STJ, AgInt no AREsp 2.638.994/RJ, Rel. Min. Maria Thereza de Assis Moura, Segunda Turma, julgado em 21/10/2024, DJe 25/10/2024)</w:t>
       </w:r>
     </w:p>
     <w:p>

</xml_diff>